<commit_message>
docs: analitica de 5 usuarios estilo Forms, graficos incrustados en AA2, infografia PPTX para Canva y enlaces/plan actualizados
</commit_message>
<xml_diff>
--- a/Docs/Evidencias/GA5-AA1-EV01_Cuestionario.docx
+++ b/Docs/Evidencias/GA5-AA1-EV01_Cuestionario.docx
@@ -463,6 +463,10 @@
           </w:tcPr>
           <w:p>
             <w:r>
+              <w:rPr>
+                <w:b/>
+                <w:sz w:val="18"/>
+              </w:rPr>
               <w:t>Aspecto evaluado</w:t>
             </w:r>
           </w:p>
@@ -473,6 +477,10 @@
           </w:tcPr>
           <w:p>
             <w:r>
+              <w:rPr>
+                <w:b/>
+                <w:sz w:val="18"/>
+              </w:rPr>
               <w:t>Preguntas</w:t>
             </w:r>
           </w:p>
@@ -485,6 +493,9 @@
           </w:tcPr>
           <w:p>
             <w:r>
+              <w:rPr>
+                <w:sz w:val="18"/>
+              </w:rPr>
               <w:t>Estructura del videojuego</w:t>
             </w:r>
           </w:p>
@@ -495,6 +506,9 @@
           </w:tcPr>
           <w:p>
             <w:r>
+              <w:rPr>
+                <w:sz w:val="18"/>
+              </w:rPr>
               <w:t>1, 2</w:t>
             </w:r>
           </w:p>
@@ -507,6 +521,9 @@
           </w:tcPr>
           <w:p>
             <w:r>
+              <w:rPr>
+                <w:sz w:val="18"/>
+              </w:rPr>
               <w:t>Interfaces (pantallas)</w:t>
             </w:r>
           </w:p>
@@ -517,6 +534,9 @@
           </w:tcPr>
           <w:p>
             <w:r>
+              <w:rPr>
+                <w:sz w:val="18"/>
+              </w:rPr>
               <w:t>3, 4</w:t>
             </w:r>
           </w:p>
@@ -529,6 +549,9 @@
           </w:tcPr>
           <w:p>
             <w:r>
+              <w:rPr>
+                <w:sz w:val="18"/>
+              </w:rPr>
               <w:t>Interactividad con el jugador</w:t>
             </w:r>
           </w:p>
@@ -539,6 +562,9 @@
           </w:tcPr>
           <w:p>
             <w:r>
+              <w:rPr>
+                <w:sz w:val="18"/>
+              </w:rPr>
               <w:t>5, 6</w:t>
             </w:r>
           </w:p>
@@ -551,6 +577,9 @@
           </w:tcPr>
           <w:p>
             <w:r>
+              <w:rPr>
+                <w:sz w:val="18"/>
+              </w:rPr>
               <w:t>Concepto gráfico (imágenes, audios)</w:t>
             </w:r>
           </w:p>
@@ -561,6 +590,9 @@
           </w:tcPr>
           <w:p>
             <w:r>
+              <w:rPr>
+                <w:sz w:val="18"/>
+              </w:rPr>
               <w:t>7, 8</w:t>
             </w:r>
           </w:p>
@@ -573,6 +605,9 @@
           </w:tcPr>
           <w:p>
             <w:r>
+              <w:rPr>
+                <w:sz w:val="18"/>
+              </w:rPr>
               <w:t>Niveles del videojuego</w:t>
             </w:r>
           </w:p>
@@ -583,6 +618,9 @@
           </w:tcPr>
           <w:p>
             <w:r>
+              <w:rPr>
+                <w:sz w:val="18"/>
+              </w:rPr>
               <w:t>9</w:t>
             </w:r>
           </w:p>
@@ -595,6 +633,9 @@
           </w:tcPr>
           <w:p>
             <w:r>
+              <w:rPr>
+                <w:sz w:val="18"/>
+              </w:rPr>
               <w:t>Mecánicas del videojuego</w:t>
             </w:r>
           </w:p>
@@ -605,6 +646,9 @@
           </w:tcPr>
           <w:p>
             <w:r>
+              <w:rPr>
+                <w:sz w:val="18"/>
+              </w:rPr>
               <w:t>10</w:t>
             </w:r>
           </w:p>

</xml_diff>